<commit_message>
feat(ingesta): antivirus en la subida (EICAR + ClamAV opcional + tope tamaño)
Escaneo del archivo antes de procesarlo (blueprint: upload → antivirus):
- app/security/antivirus.py: firma estándar EICAR (determinista, sin infra) +
  ClamAV opcional si hay daemon (host/puerto o socket) + tope de tamaño.
- documents.upload rechaza (422) y audita los archivos infectados/grandes.
- Config: ANTIVIRUS_ENABLED, CLAMAV_HOST/PORT/SOCKET, MAX_UPLOAD_MB.
- Pruebas: limpio/EICAR/oversize + bloqueo y archivo limpio por la API. 198 verde.
- Docs v2 + CHANGELOG + ESTADO: antivirus marcado como hecho.

Co-Authored-By: Claude Opus 4.8 <noreply@anthropic.com>
Claude-Session: https://claude.ai/code/session_01HTAvTHuepv1vkFtVGxRvVu
</commit_message>
<xml_diff>
--- a/docs/generados/MaestroAI-Tecnico-v2.docx
+++ b/docs/generados/MaestroAI-Tecnico-v2.docx
@@ -459,7 +459,36 @@
               <w:rPr>
                 <w:sz w:val="18"/>
               </w:rPr>
-              <w:t>Ingesta: antivirus + OCR de escaneados</w:t>
+              <w:t>Ingesta: antivirus (EICAR + ClamAV opcional) + tope de tamaño</w:t>
+            </w:r>
+          </w:p>
+        </w:tc>
+        <w:tc>
+          <w:tcPr>
+            <w:tcW w:type="dxa" w:w="4320"/>
+          </w:tcPr>
+          <w:p>
+            <w:r>
+              <w:rPr>
+                <w:color w:val="15803D"/>
+                <w:sz w:val="18"/>
+              </w:rPr>
+              <w:t>Hecho (v2)</w:t>
+            </w:r>
+          </w:p>
+        </w:tc>
+      </w:tr>
+      <w:tr>
+        <w:tc>
+          <w:tcPr>
+            <w:tcW w:type="dxa" w:w="4320"/>
+          </w:tcPr>
+          <w:p>
+            <w:r>
+              <w:rPr>
+                <w:sz w:val="18"/>
+              </w:rPr>
+              <w:t>Ingesta: OCR de escaneados</w:t>
             </w:r>
           </w:p>
         </w:tc>
@@ -472,7 +501,7 @@
               <w:rPr>
                 <w:sz w:val="18"/>
               </w:rPr>
-              <w:t>Parcial (OCR opcional; AV pendiente)</w:t>
+              <w:t>Parcial (opcional si hay binario)</w:t>
             </w:r>
           </w:p>
         </w:tc>
@@ -2827,7 +2856,7 @@
         <w:pStyle w:val="Heading2"/>
       </w:pPr>
       <w:r>
-        <w:t>Ingesta avanzada — antivirus + OCR</w:t>
+        <w:t>OCR de escaneados (completar ingesta avanzada)</w:t>
       </w:r>
     </w:p>
     <w:p>
@@ -2844,7 +2873,7 @@
           <w:color w:val="334155"/>
           <w:sz w:val="21"/>
         </w:rPr>
-        <w:t>Escanear con antivirus el archivo subido y aplicar OCR a PDFs escaneados (sin capa de texto).</w:t>
+        <w:t>Aplicar OCR a PDFs escaneados sin capa de texto (el antivirus en la ingesta ya quedó hecho).</w:t>
       </w:r>
     </w:p>
     <w:p>
@@ -2861,7 +2890,7 @@
           <w:color w:val="334155"/>
           <w:sz w:val="21"/>
         </w:rPr>
-        <w:t>El blueprint pide «upload → antivirus → OCR si aplica → clasificación». Hoy ya extraemos texto de PDF/DOCX; falta AV y OCR de imágenes/escaneados.</w:t>
+        <w:t>Completa «upload → antivirus → OCR si aplica → clasificación» del blueprint.</w:t>
       </w:r>
     </w:p>
     <w:p>
@@ -2878,7 +2907,7 @@
           <w:color w:val="334155"/>
           <w:sz w:val="21"/>
         </w:rPr>
-        <w:t>OCR: pytesseract + pdf2image + binario tesseract (ya soportado de forma opcional en el código). Antivirus: ClamAV (clamd) o un servicio de análisis; rechazar/cuarentena si da positivo.</w:t>
+        <w:t>pytesseract + pdf2image + binario tesseract (ya soportado de forma opcional en el código); instalar el binario en el contenedor para activarlo.</w:t>
       </w:r>
     </w:p>
     <w:p>
@@ -2895,7 +2924,7 @@
           <w:color w:val="334155"/>
           <w:sz w:val="21"/>
         </w:rPr>
-        <w:t>tesseract-ocr, poppler, pytesseract, pdf2image; clamav/clamd o API.</w:t>
+        <w:t>tesseract-ocr, poppler, pytesseract, pdf2image.</w:t>
       </w:r>
     </w:p>
     <w:p>

</xml_diff>

<commit_message>
feat(seguridad): MFA (TOTP) + OCR de escaneados en la imagen
MFA (blueprint «RBAC + MFA»):
- app/mfa.py (pyotp): secreto TOTP cifrado, enrolamiento, verificación y códigos
  de respaldo de un solo uso.
- /auth/mfa/setup|verify|disable; el login exige código si MFA está activo (solo
  si hay secreto enrolado → sin lockout). Seed: demo admin sin MFA.
- UI: sección en Mi cuenta (activar/verificar/respaldo/desactivar) + reto en login.
- Pruebas: enrolar→verificar→login exige código→respaldo de un solo uso→desactivar.

OCR de escaneados:
- Dockerfile instala tesseract-ocr + poppler; requirements + pytesseract/pdf2image.
  Los PDFs sin capa de texto pasan por OCR en la ingesta (degrada si no hay binario).

200 pruebas en verde; tsc del portal limpio. Docs v2 + CHANGELOG + ESTADO.

Co-Authored-By: Claude Opus 4.8 <noreply@anthropic.com>
Claude-Session: https://claude.ai/code/session_01HTAvTHuepv1vkFtVGxRvVu
</commit_message>
<xml_diff>
--- a/docs/generados/MaestroAI-Tecnico-v2.docx
+++ b/docs/generados/MaestroAI-Tecnico-v2.docx
@@ -488,7 +488,7 @@
               <w:rPr>
                 <w:sz w:val="18"/>
               </w:rPr>
-              <w:t>Ingesta: OCR de escaneados</w:t>
+              <w:t>Ingesta: OCR de escaneados (tesseract en la imagen)</w:t>
             </w:r>
           </w:p>
         </w:tc>
@@ -499,9 +499,10 @@
           <w:p>
             <w:r>
               <w:rPr>
+                <w:color w:val="15803D"/>
                 <w:sz w:val="18"/>
               </w:rPr>
-              <w:t>Parcial (opcional si hay binario)</w:t>
+              <w:t>Hecho (v2)</w:t>
             </w:r>
           </w:p>
         </w:tc>
@@ -516,7 +517,7 @@
               <w:rPr>
                 <w:sz w:val="18"/>
               </w:rPr>
-              <w:t>MFA (multi-factor)</w:t>
+              <w:t>MFA (TOTP) + códigos de respaldo, exigido en login</w:t>
             </w:r>
           </w:p>
         </w:tc>
@@ -527,10 +528,10 @@
           <w:p>
             <w:r>
               <w:rPr>
-                <w:color w:val="B45309"/>
+                <w:color w:val="15803D"/>
                 <w:sz w:val="18"/>
               </w:rPr>
-              <w:t>Pendiente (campo listo, sin forzar)</w:t>
+              <w:t>Hecho (v2)</w:t>
             </w:r>
           </w:p>
         </w:tc>
@@ -2849,158 +2850,6 @@
       </w:pPr>
       <w:r>
         <w:t>5. Pendientes por construir (especificación v2)</w:t>
-      </w:r>
-    </w:p>
-    <w:p>
-      <w:pPr>
-        <w:pStyle w:val="Heading2"/>
-      </w:pPr>
-      <w:r>
-        <w:t>OCR de escaneados (completar ingesta avanzada)</w:t>
-      </w:r>
-    </w:p>
-    <w:p>
-      <w:r>
-        <w:rPr>
-          <w:b/>
-          <w:color w:val="6D28D9"/>
-          <w:sz w:val="21"/>
-        </w:rPr>
-        <w:t xml:space="preserve">Qué: </w:t>
-      </w:r>
-      <w:r>
-        <w:rPr>
-          <w:color w:val="334155"/>
-          <w:sz w:val="21"/>
-        </w:rPr>
-        <w:t>Aplicar OCR a PDFs escaneados sin capa de texto (el antivirus en la ingesta ya quedó hecho).</w:t>
-      </w:r>
-    </w:p>
-    <w:p>
-      <w:r>
-        <w:rPr>
-          <w:b/>
-          <w:color w:val="6D28D9"/>
-          <w:sz w:val="21"/>
-        </w:rPr>
-        <w:t xml:space="preserve">Por qué: </w:t>
-      </w:r>
-      <w:r>
-        <w:rPr>
-          <w:color w:val="334155"/>
-          <w:sz w:val="21"/>
-        </w:rPr>
-        <w:t>Completa «upload → antivirus → OCR si aplica → clasificación» del blueprint.</w:t>
-      </w:r>
-    </w:p>
-    <w:p>
-      <w:r>
-        <w:rPr>
-          <w:b/>
-          <w:color w:val="6D28D9"/>
-          <w:sz w:val="21"/>
-        </w:rPr>
-        <w:t xml:space="preserve">Cómo: </w:t>
-      </w:r>
-      <w:r>
-        <w:rPr>
-          <w:color w:val="334155"/>
-          <w:sz w:val="21"/>
-        </w:rPr>
-        <w:t>pytesseract + pdf2image + binario tesseract (ya soportado de forma opcional en el código); instalar el binario en el contenedor para activarlo.</w:t>
-      </w:r>
-    </w:p>
-    <w:p>
-      <w:r>
-        <w:rPr>
-          <w:b/>
-          <w:color w:val="64748B"/>
-          <w:sz w:val="21"/>
-        </w:rPr>
-        <w:t xml:space="preserve">Dependencias: </w:t>
-      </w:r>
-      <w:r>
-        <w:rPr>
-          <w:color w:val="334155"/>
-          <w:sz w:val="21"/>
-        </w:rPr>
-        <w:t>tesseract-ocr, poppler, pytesseract, pdf2image.</w:t>
-      </w:r>
-    </w:p>
-    <w:p>
-      <w:pPr>
-        <w:pStyle w:val="Heading2"/>
-      </w:pPr>
-      <w:r>
-        <w:t>MFA (multi-factor) — TOTP</w:t>
-      </w:r>
-    </w:p>
-    <w:p>
-      <w:r>
-        <w:rPr>
-          <w:b/>
-          <w:color w:val="6D28D9"/>
-          <w:sz w:val="21"/>
-        </w:rPr>
-        <w:t xml:space="preserve">Qué: </w:t>
-      </w:r>
-      <w:r>
-        <w:rPr>
-          <w:color w:val="334155"/>
-          <w:sz w:val="21"/>
-        </w:rPr>
-        <w:t>Segundo factor en el login (app autenticadora) con enrolamiento, verificación y códigos de respaldo.</w:t>
-      </w:r>
-    </w:p>
-    <w:p>
-      <w:r>
-        <w:rPr>
-          <w:b/>
-          <w:color w:val="6D28D9"/>
-          <w:sz w:val="21"/>
-        </w:rPr>
-        <w:t xml:space="preserve">Por qué: </w:t>
-      </w:r>
-      <w:r>
-        <w:rPr>
-          <w:color w:val="334155"/>
-          <w:sz w:val="21"/>
-        </w:rPr>
-        <w:t>El blueprint incluye «RBAC + MFA». El modelo ya tiene el campo mfa_enabled; falta el flujo.</w:t>
-      </w:r>
-    </w:p>
-    <w:p>
-      <w:r>
-        <w:rPr>
-          <w:b/>
-          <w:color w:val="6D28D9"/>
-          <w:sz w:val="21"/>
-        </w:rPr>
-        <w:t xml:space="preserve">Cómo: </w:t>
-      </w:r>
-      <w:r>
-        <w:rPr>
-          <w:color w:val="334155"/>
-          <w:sz w:val="21"/>
-        </w:rPr>
-        <w:t>pyotp (TOTP) + QR de enrolamiento; reto de MFA tras la contraseña cuando mfa_enabled=true; códigos de recuperación cifrados.</w:t>
-      </w:r>
-    </w:p>
-    <w:p>
-      <w:r>
-        <w:rPr>
-          <w:b/>
-          <w:color w:val="64748B"/>
-          <w:sz w:val="21"/>
-        </w:rPr>
-        <w:t xml:space="preserve">Dependencias: </w:t>
-      </w:r>
-      <w:r>
-        <w:rPr>
-          <w:color w:val="334155"/>
-          <w:sz w:val="21"/>
-        </w:rPr>
-        <w:t>pyotp (software puro).</w:t>
       </w:r>
     </w:p>
     <w:p>

</xml_diff>

<commit_message>
feat(finetune): andamiaje LoRA (datasets/anonimización/gate/jobs) + lab local
Fase 5 del blueprint (parte de software, independiente de GPU):
- Modelos FineTuneDataset/Example/Job; router /finetune (ADMIN/DEVOPS).
- Ejemplos anonimizados (PII redactada) al guardar; gate de calidad + red-team
  (mínimo de ejemplos, sin PII residual, sin inyección); export JSONL (chat).
- from-memory: construye dataset desde trabajos en Memoria.
- jobs: despacho a trainer externo (FINETUNE_TRAINER_URL: servidor GPU / App NaN /
  webhook n8n) o 'simulado' (laboratorio); callback para reportar adapter/serve_base_url.
- Config FINETUNE_*; guía docs/FINETUNING-SETUP.md (lab con GPU local + Ollama + n8n).
- Pruebas: anonimización, gate, from-memory, job simulado + callback. 204 en verde.

Co-Authored-By: Claude Opus 4.8 <noreply@anthropic.com>
Claude-Session: https://claude.ai/code/session_01HTAvTHuepv1vkFtVGxRvVu
</commit_message>
<xml_diff>
--- a/docs/generados/MaestroAI-Tecnico-v2.docx
+++ b/docs/generados/MaestroAI-Tecnico-v2.docx
@@ -546,7 +546,7 @@
               <w:rPr>
                 <w:sz w:val="18"/>
               </w:rPr>
-              <w:t>Fine-tuning ligero (LoRA) real</w:t>
+              <w:t>Fine-tuning LoRA: andamiaje (datasets/anonimización/gate/jobs)</w:t>
             </w:r>
           </w:p>
         </w:tc>
@@ -557,10 +557,38 @@
           <w:p>
             <w:r>
               <w:rPr>
-                <w:color w:val="B45309"/>
+                <w:color w:val="15803D"/>
                 <w:sz w:val="18"/>
               </w:rPr>
-              <w:t>Pendiente (Fase 5)</w:t>
+              <w:t>Hecho (v2)</w:t>
+            </w:r>
+          </w:p>
+        </w:tc>
+      </w:tr>
+      <w:tr>
+        <w:tc>
+          <w:tcPr>
+            <w:tcW w:type="dxa" w:w="4320"/>
+          </w:tcPr>
+          <w:p>
+            <w:r>
+              <w:rPr>
+                <w:sz w:val="18"/>
+              </w:rPr>
+              <w:t>Fine-tuning LoRA: entrenamiento real en GPU</w:t>
+            </w:r>
+          </w:p>
+        </w:tc>
+        <w:tc>
+          <w:tcPr>
+            <w:tcW w:type="dxa" w:w="4320"/>
+          </w:tcPr>
+          <w:p>
+            <w:r>
+              <w:rPr>
+                <w:sz w:val="18"/>
+              </w:rPr>
+              <w:t>Parcial (trainer externo/lab)</w:t>
             </w:r>
           </w:p>
         </w:tc>
@@ -2857,7 +2885,7 @@
         <w:pStyle w:val="Heading2"/>
       </w:pPr>
       <w:r>
-        <w:t>Fine-tuning ligero (LoRA)</w:t>
+        <w:t>Fine-tuning LoRA — entrenamiento real en GPU</w:t>
       </w:r>
     </w:p>
     <w:p>
@@ -2874,7 +2902,7 @@
           <w:color w:val="334155"/>
           <w:sz w:val="21"/>
         </w:rPr>
-        <w:t>Pipeline de dataset → anonimización → versionado → entrenamiento LoRA → evals → red team → despliegue.</w:t>
+        <w:t>Conectar el andamiaje (ya hecho: datasets/anonimización/gate/jobs) a un trainer con GPU que entrene el adapter y lo sirva.</w:t>
       </w:r>
     </w:p>
     <w:p>
@@ -2891,7 +2919,7 @@
           <w:color w:val="334155"/>
           <w:sz w:val="21"/>
         </w:rPr>
-        <w:t>Fase 5 del blueprint para comportamiento/formato repetitivo (no para conocimiento, que va por RAG).</w:t>
+        <w:t>El software ya está; falta el backend de cómputo (GPU) y servir el adapter (Ollama/vLLM).</w:t>
       </w:r>
     </w:p>
     <w:p>
@@ -2908,7 +2936,7 @@
           <w:color w:val="334155"/>
           <w:sz w:val="21"/>
         </w:rPr>
-        <w:t>Servicio de entrenamiento (GPU) con registro de datasets y evaluaciones; integración como ruta de modelo.</w:t>
+        <w:t>Trainer (servidor GPU / App NaN / webhook n8n) que recibe el JSONL, entrena PEFT/LoRA y hace callback; servir como ruta local/VPC. Ver docs/FINETUNING-SETUP.md.</w:t>
       </w:r>
     </w:p>
     <w:p>
@@ -2925,7 +2953,7 @@
           <w:color w:val="334155"/>
           <w:sz w:val="21"/>
         </w:rPr>
-        <w:t>Infraestructura GPU + framework de fine-tuning.</w:t>
+        <w:t>GPU (local o NaN) + PEFT/transformers; Ollama/vLLM para servir.</w:t>
       </w:r>
     </w:p>
     <w:p>

</xml_diff>